<commit_message>
Add dashboard layour screens
</commit_message>
<xml_diff>
--- a/puneeth/puneeth_frontend_document.docx
+++ b/puneeth/puneeth_frontend_document.docx
@@ -302,6 +302,394 @@
     <w:p>
       <w:r>
         <w:t>Day 1 focused on building a structured, PRD-aligned frontend dashboard foundation ready for backend integration.</w:t>
+      </w:r>
+    </w:p>
+    <w:p/>
+    <w:p/>
+    <w:p>
+      <w:pPr>
+        <w:jc w:val="center"/>
+      </w:pPr>
+      <w:r>
+        <w:rPr>
+          <w:b/>
+          <w:sz w:val="36"/>
+        </w:rPr>
+        <w:t>Tenar WhatsApp Bot – Day 2 Summary (Frontend Team)</w:t>
+      </w:r>
+    </w:p>
+    <w:p/>
+    <w:p>
+      <w:r>
+        <w:rPr>
+          <w:b/>
+          <w:sz w:val="28"/>
+        </w:rPr>
+        <w:t>Day 2 — Work Summary (Frontend Team: Hitha &amp; Puneeth)</w:t>
+      </w:r>
+    </w:p>
+    <w:p>
+      <w:r>
+        <w:t>On Day 2, the objective was to extend the Day 1 foundation into a fully usable Dashboard Base Layout Screen. The team iterated on existing components and files without altering the folder structure or rewriting working Day 1 code.</w:t>
+      </w:r>
+    </w:p>
+    <w:p>
+      <w:r>
+        <w:t>All changes were strictly UI-only — no backend integration, no API calls, and no business logic was introduced.</w:t>
+      </w:r>
+    </w:p>
+    <w:p>
+      <w:r>
+        <w:t>The following upgrades were made across three existing files:</w:t>
+      </w:r>
+    </w:p>
+    <w:p>
+      <w:r>
+        <w:rPr>
+          <w:b/>
+        </w:rPr>
+        <w:t>1. counters.py — Redesigned Counter Cards (Hitha)</w:t>
+      </w:r>
+    </w:p>
+    <w:p>
+      <w:r>
+        <w:t>The Day 1 counter section had 4 generic placeholder metrics (Total, Running, Completed, Failed) with no values. This was replaced with 3 business-meaningful KPI cards aligned with the PRD:</w:t>
+      </w:r>
+    </w:p>
+    <w:p>
+      <w:pPr>
+        <w:pStyle w:val="ListBullet"/>
+      </w:pPr>
+      <w:r>
+        <w:t>Total Jobs Today — dummy value: 25</w:t>
+      </w:r>
+    </w:p>
+    <w:p>
+      <w:pPr>
+        <w:pStyle w:val="ListBullet"/>
+      </w:pPr>
+      <w:r>
+        <w:t>Total Jobs This Week — dummy value: 140</w:t>
+      </w:r>
+    </w:p>
+    <w:p>
+      <w:pPr>
+        <w:pStyle w:val="ListBullet"/>
+      </w:pPr>
+      <w:r>
+        <w:t>Unique CHAs — dummy value: 5</w:t>
+      </w:r>
+    </w:p>
+    <w:p>
+      <w:r>
+        <w:t>The render_counters() function was made integration-ready by accepting an optional data dict as a parameter. When no data is passed, it falls back to _get_counts() (stub). On Day 3, this will be replaced with a live api_client call.</w:t>
+      </w:r>
+    </w:p>
+    <w:p>
+      <w:r>
+        <w:rPr>
+          <w:b/>
+        </w:rPr>
+        <w:t>2. jobs_table.py — Realistic Jobs Table (Hitha)</w:t>
+      </w:r>
+    </w:p>
+    <w:p>
+      <w:r>
+        <w:t>The Day 1 jobs table had 3 blank stub rows with no timestamps, all showing “—” across every column. This was replaced with 7 realistic dummy rows that accurately reflect the final data shape:</w:t>
+      </w:r>
+    </w:p>
+    <w:p>
+      <w:pPr>
+        <w:pStyle w:val="ListBullet"/>
+      </w:pPr>
+      <w:r>
+        <w:t>Columns: Job ID, Status, Timestamp, Phone (masked), File Type, CHA Reply, Actions</w:t>
+      </w:r>
+    </w:p>
+    <w:p>
+      <w:pPr>
+        <w:pStyle w:val="ListBullet"/>
+      </w:pPr>
+      <w:r>
+        <w:t>Phone numbers masked as +91 ××××-XXXX format</w:t>
+      </w:r>
+    </w:p>
+    <w:p>
+      <w:pPr>
+        <w:pStyle w:val="ListBullet"/>
+      </w:pPr>
+      <w:r>
+        <w:t>File types varied between PDF and Image</w:t>
+      </w:r>
+    </w:p>
+    <w:p>
+      <w:pPr>
+        <w:pStyle w:val="ListBullet"/>
+      </w:pPr>
+      <w:r>
+        <w:t>Statuses spread across: running, completed, failed — to test all badge colours</w:t>
+      </w:r>
+    </w:p>
+    <w:p>
+      <w:pPr>
+        <w:pStyle w:val="ListBullet"/>
+      </w:pPr>
+      <w:r>
+        <w:t>Re-run button present per row (UI only, shows a toast notification on click)</w:t>
+      </w:r>
+    </w:p>
+    <w:p>
+      <w:r>
+        <w:t>The render_jobs_table() function was made integration-ready by accepting an optional jobs list parameter, enabling Day 3 to pass live data without touching the component’s rendering logic.</w:t>
+      </w:r>
+    </w:p>
+    <w:p>
+      <w:r>
+        <w:rPr>
+          <w:b/>
+        </w:rPr>
+        <w:t>3. api_client.py — New Stub Functions (Puneeth)</w:t>
+      </w:r>
+    </w:p>
+    <w:p>
+      <w:r>
+        <w:t>Two new stub functions were added to services/api_client.py to support the upgraded counter cards:</w:t>
+      </w:r>
+    </w:p>
+    <w:p>
+      <w:pPr>
+        <w:pStyle w:val="ListBullet"/>
+      </w:pPr>
+      <w:r>
+        <w:t>get_jobs_this_week() — stub for GET /jobs/week endpoint</w:t>
+      </w:r>
+    </w:p>
+    <w:p>
+      <w:pPr>
+        <w:pStyle w:val="ListBullet"/>
+      </w:pPr>
+      <w:r>
+        <w:t>get_unique_chas() — stub for GET /chas/active endpoint</w:t>
+      </w:r>
+    </w:p>
+    <w:p>
+      <w:r>
+        <w:t>All existing Day 1 functions (get_jobs, get_job_details, rerun_job) were left untouched. Each new function contains a TODO Day 3 comment with the exact endpoint path, so Puneeth can uncomment and wire them directly when the backend is ready.</w:t>
+      </w:r>
+    </w:p>
+    <w:p>
+      <w:r>
+        <w:rPr>
+          <w:b/>
+        </w:rPr>
+        <w:t>4. streamlit_app.py — Minor Header Updates (Both)</w:t>
+      </w:r>
+    </w:p>
+    <w:p>
+      <w:r>
+        <w:t>Only 2 lines were changed in the entry point file, keeping all Day 1 layout, CSS, and section structure intact:</w:t>
+      </w:r>
+    </w:p>
+    <w:p>
+      <w:pPr>
+        <w:pStyle w:val="ListBullet"/>
+      </w:pPr>
+      <w:r>
+        <w:t>Subtitle updated from “Day 1 scaffold” to “WhatsApp Bot Monitoring”</w:t>
+      </w:r>
+    </w:p>
+    <w:p>
+      <w:pPr>
+        <w:pStyle w:val="ListBullet"/>
+      </w:pPr>
+      <w:r>
+        <w:t>Status indicator updated from “Backend not connected” to “No backend (Day 3)”</w:t>
+      </w:r>
+    </w:p>
+    <w:p/>
+    <w:p>
+      <w:r>
+        <w:rPr>
+          <w:b/>
+          <w:sz w:val="28"/>
+        </w:rPr>
+        <w:t>Day 2 — Learning Outcomes</w:t>
+      </w:r>
+    </w:p>
+    <w:p>
+      <w:r>
+        <w:t>Technical Learning:</w:t>
+      </w:r>
+    </w:p>
+    <w:p>
+      <w:pPr>
+        <w:pStyle w:val="ListBullet"/>
+      </w:pPr>
+      <w:r>
+        <w:t>Iterated on existing code without breaking working Day 1 functionality</w:t>
+      </w:r>
+    </w:p>
+    <w:p>
+      <w:pPr>
+        <w:pStyle w:val="ListBullet"/>
+      </w:pPr>
+      <w:r>
+        <w:t>Designed components with optional parameters to make them integration-ready</w:t>
+      </w:r>
+    </w:p>
+    <w:p>
+      <w:pPr>
+        <w:pStyle w:val="ListBullet"/>
+      </w:pPr>
+      <w:r>
+        <w:t>Used realistic dummy data to validate the full column layout before backend is available</w:t>
+      </w:r>
+    </w:p>
+    <w:p>
+      <w:pPr>
+        <w:pStyle w:val="ListBullet"/>
+      </w:pPr>
+      <w:r>
+        <w:t>Understood how to stub new API functions with clean TODO markers for future handoff</w:t>
+      </w:r>
+    </w:p>
+    <w:p>
+      <w:pPr>
+        <w:pStyle w:val="ListBullet"/>
+      </w:pPr>
+      <w:r>
+        <w:t>Learned to scope changes minimally — only modify what Day 2 explicitly requires</w:t>
+      </w:r>
+    </w:p>
+    <w:p>
+      <w:r>
+        <w:t>Project &amp; Team Learning:</w:t>
+      </w:r>
+    </w:p>
+    <w:p>
+      <w:pPr>
+        <w:pStyle w:val="ListBullet"/>
+      </w:pPr>
+      <w:r>
+        <w:t>Maintained clean separation of concerns between Hitha (UI) and Puneeth (integration layer)</w:t>
+      </w:r>
+    </w:p>
+    <w:p>
+      <w:pPr>
+        <w:pStyle w:val="ListBullet"/>
+      </w:pPr>
+      <w:r>
+        <w:t>Confirmed the importance of not over-building — Day 2 touched only 4 files and 2 lines in one of them</w:t>
+      </w:r>
+    </w:p>
+    <w:p>
+      <w:pPr>
+        <w:pStyle w:val="ListBullet"/>
+      </w:pPr>
+      <w:r>
+        <w:t>Diff-verified changes to ensure no unintended side effects on Day 1 code</w:t>
+      </w:r>
+    </w:p>
+    <w:p>
+      <w:r>
+        <w:t>Practical Insights:</w:t>
+      </w:r>
+    </w:p>
+    <w:p>
+      <w:pPr>
+        <w:pStyle w:val="ListBullet"/>
+      </w:pPr>
+      <w:r>
+        <w:t>Realistic dummy data exposes layout issues early — blank stubs hide column width and overflow problems</w:t>
+      </w:r>
+    </w:p>
+    <w:p>
+      <w:pPr>
+        <w:pStyle w:val="ListBullet"/>
+      </w:pPr>
+      <w:r>
+        <w:t>Optional function parameters are the cleanest way to make UI components backend-agnostic</w:t>
+      </w:r>
+    </w:p>
+    <w:p>
+      <w:pPr>
+        <w:pStyle w:val="ListBullet"/>
+      </w:pPr>
+      <w:r>
+        <w:t>Keeping TODO comments tied to specific day milestones (DAY-3, DAY-4) reduces handoff confusion</w:t>
+      </w:r>
+    </w:p>
+    <w:p/>
+    <w:p>
+      <w:r>
+        <w:rPr>
+          <w:b/>
+          <w:sz w:val="28"/>
+        </w:rPr>
+        <w:t>Day 2 — Status</w:t>
+      </w:r>
+    </w:p>
+    <w:p>
+      <w:pPr>
+        <w:pStyle w:val="ListBullet"/>
+      </w:pPr>
+      <w:r>
+        <w:t>Counter cards redesigned (3 KPIs with dummy values) — Completed</w:t>
+      </w:r>
+    </w:p>
+    <w:p>
+      <w:pPr>
+        <w:pStyle w:val="ListBullet"/>
+      </w:pPr>
+      <w:r>
+        <w:t>Jobs table upgraded (7 realistic dummy rows, all columns visible) — Completed</w:t>
+      </w:r>
+    </w:p>
+    <w:p>
+      <w:pPr>
+        <w:pStyle w:val="ListBullet"/>
+      </w:pPr>
+      <w:r>
+        <w:t>API client extended with 2 new stubs — Completed</w:t>
+      </w:r>
+    </w:p>
+    <w:p>
+      <w:pPr>
+        <w:pStyle w:val="ListBullet"/>
+      </w:pPr>
+      <w:r>
+        <w:t>Components made integration-ready (optional data parameters) — Completed</w:t>
+      </w:r>
+    </w:p>
+    <w:p>
+      <w:pPr>
+        <w:pStyle w:val="ListBullet"/>
+      </w:pPr>
+      <w:r>
+        <w:t>Folder structure unchanged, no Day 1 files broken — Verified</w:t>
+      </w:r>
+    </w:p>
+    <w:p>
+      <w:pPr>
+        <w:pStyle w:val="ListBullet"/>
+      </w:pPr>
+      <w:r>
+        <w:t>Backend integration — Not started (Day 3 scope)</w:t>
+      </w:r>
+    </w:p>
+    <w:p/>
+    <w:p>
+      <w:r>
+        <w:rPr>
+          <w:b/>
+          <w:sz w:val="28"/>
+        </w:rPr>
+        <w:t>One-Line Summary</w:t>
+      </w:r>
+    </w:p>
+    <w:p>
+      <w:r>
+        <w:t>Day 2 extended the Day 1 scaffold into a fully reviewable dashboard layout with realistic dummy data, integration-ready components, and zero changes to the existing folder structure or working code.</w:t>
       </w:r>
     </w:p>
     <w:sectPr>

</xml_diff>